<commit_message>
feat: update causal-report to v1.3.0 from Matthew63 P2R
Co-Authored-By: Claude Opus 5.5 (1M context) <noreply@anthropic.com>
</commit_message>
<xml_diff>
--- a/.claude/skills/causal-report/examples/01_elements.docx
+++ b/.claude/skills/causal-report/examples/01_elements.docx
@@ -2,7 +2,15 @@
 <file path=word/document.xml><?xml version="1.0" encoding="utf-8"?>
 <w:document xmlns:wpc="http://schemas.microsoft.com/office/word/2010/wordprocessingCanvas" xmlns:cx="http://schemas.microsoft.com/office/drawing/2014/chartex" xmlns:cx1="http://schemas.microsoft.com/office/drawing/2015/9/8/chartex" xmlns:cx2="http://schemas.microsoft.com/office/drawing/2015/10/21/chartex" xmlns:cx3="http://schemas.microsoft.com/office/drawing/2016/5/9/chartex" xmlns:cx4="http://schemas.microsoft.com/office/drawing/2016/5/10/chartex" xmlns:cx5="http://schemas.microsoft.com/office/drawing/2016/5/11/chartex" xmlns:cx6="http://schemas.microsoft.com/office/drawing/2016/5/12/chartex" xmlns:cx7="http://schemas.microsoft.com/office/drawing/2016/5/13/chartex" xmlns:cx8="http://schemas.microsoft.com/office/drawing/2016/5/14/chartex" xmlns:mc="http://schemas.openxmlformats.org/markup-compatibility/2006" xmlns:m="http://schemas.openxmlformats.org/officeDocument/2006/math" xmlns:aink="http://schemas.microsoft.com/office/drawing/2016/ink" xmlns:am3d="http://schemas.microsoft.com/office/drawing/2017/model3d" xmlns:oel="http://schemas.microsoft.com/office/2019/extlst" xmlns:r="http://schemas.openxmlformats.org/officeDocument/2006/relationships" xmlns:wp14="http://schemas.microsoft.com/office/word/2010/wordprocessingDrawing" xmlns:wp="http://schemas.openxmlformats.org/drawingml/2006/wordprocessingDrawing" xmlns:wpg="http://schemas.microsoft.com/office/word/2010/wordprocessingGroup" xmlns:wpi="http://schemas.microsoft.com/office/word/2010/wordprocessingInk" xmlns:wps="http://schemas.microsoft.com/office/word/2010/wordprocessingShape" xmlns:o="urn:schemas-microsoft-com:office:office" xmlns:v="urn:schemas-microsoft-com:vml" xmlns:w10="urn:schemas-microsoft-com:office:word" xmlns:w="http://schemas.openxmlformats.org/wordprocessingml/2006/main" xmlns:w14="http://schemas.microsoft.com/office/word/2010/wordml" xmlns:w15="http://schemas.microsoft.com/office/word/2012/wordml" xmlns:w16cex="http://schemas.microsoft.com/office/word/2018/wordml/cex" xmlns:w16cid="http://schemas.microsoft.com/office/word/2016/wordml/cid" xmlns:w16="http://schemas.microsoft.com/office/word/2018/wordml" xmlns:w16sdtdh="http://schemas.microsoft.com/office/word/2020/wordml/sdtdatahash" xmlns:w16sdtfl="http://schemas.microsoft.com/office/word/2024/wordml/sdtformatlock" xmlns:w16se="http://schemas.microsoft.com/office/word/2015/wordml/symex" xmlns:w16du="http://schemas.microsoft.com/office/word/2023/wordml/word16du" xmlns:wne="http://schemas.microsoft.com/office/word/2006/wordml" mc:Ignorable="w14 w15 w16se w16cid w16 w16cex w16sdtdh w16sdtfl w16du wp14">
   <w:body>
-    <w:p/>
+    <w:p>
+      <w:pPr>
+        <w:spacing w:before="0" w:after="0" w:line="40" w:lineRule="exact"/>
+        <w:rPr>
+          <w:sz w:val="4"/>
+          <w:szCs w:val="4"/>
+        </w:rPr>
+      </w:pPr>
+    </w:p>
     <w:tbl>
       <w:tblPr>
         <w:tblStyle w:val="a"/>
@@ -26,7 +34,7 @@
       </w:tblGrid>
       <w:tr>
         <w:trPr>
-          <w:trHeight w:val="11006"/>
+          <w:trHeight w:val="10700" w:hRule="exact"/>
           <w:jc w:val="center"/>
         </w:trPr>
         <w:tc>
@@ -59,19 +67,13 @@
       </w:tr>
       <w:tr>
         <w:trPr>
-          <w:trHeight w:val="966"/>
+          <w:trHeight w:val="1450" w:hRule="exact"/>
           <w:jc w:val="center"/>
         </w:trPr>
         <w:tc>
           <w:tcPr>
-            <w:tcW w:w="6511" w:type="dxa"/>
-            <w:vAlign w:val="bottom"/>
-          </w:tcPr>
-          <w:p/>
-        </w:tc>
-        <w:tc>
-          <w:tcPr>
-            <w:tcW w:w="3911" w:type="dxa"/>
+            <w:tcW w:w="10422" w:type="dxa"/>
+            <w:gridSpan w:val="2"/>
             <w:vAlign w:val="bottom"/>
           </w:tcPr>
           <w:p>
@@ -164,6 +166,11 @@
     </w:tbl>
     <w:p>
       <w:pPr>
+        <w:spacing w:before="0" w:after="0" w:line="40" w:lineRule="exact"/>
+        <w:rPr>
+          <w:sz w:val="4"/>
+          <w:szCs w:val="4"/>
+        </w:rPr>
         <w:sectPr>
           <w:headerReference w:type="even" r:id="rId7"/>
           <w:headerReference w:type="default" r:id="rId8"/>
@@ -420,15 +427,13 @@
             <w:pPr>
               <w:rPr>
                 <w:color w:val="000000"/>
-                <w:highlight w:val="yellow"/>
               </w:rPr>
             </w:pPr>
             <w:r>
               <w:rPr>
                 <w:color w:val="000000"/>
-                <w:highlight w:val="yellow"/>
               </w:rPr>
-              <w:t>###</w:t>
+              <w:t>CD</w:t>
             </w:r>
           </w:p>
         </w:tc>
@@ -440,15 +445,13 @@
             <w:pPr>
               <w:rPr>
                 <w:color w:val="000000"/>
-                <w:highlight w:val="yellow"/>
               </w:rPr>
             </w:pPr>
             <w:r>
               <w:rPr>
                 <w:color w:val="000000"/>
-                <w:highlight w:val="yellow"/>
               </w:rPr>
-              <w:t>###</w:t>
+              <w:t>Causal Design</w:t>
             </w:r>
           </w:p>
         </w:tc>
@@ -465,15 +468,13 @@
             <w:pPr>
               <w:rPr>
                 <w:color w:val="000000"/>
-                <w:highlight w:val="yellow"/>
               </w:rPr>
             </w:pPr>
             <w:r>
               <w:rPr>
                 <w:color w:val="000000"/>
-                <w:highlight w:val="yellow"/>
               </w:rPr>
-              <w:t>###</w:t>
+              <w:t>MDE</w:t>
             </w:r>
           </w:p>
         </w:tc>
@@ -485,465 +486,13 @@
             <w:pPr>
               <w:rPr>
                 <w:color w:val="000000"/>
-                <w:highlight w:val="yellow"/>
               </w:rPr>
             </w:pPr>
             <w:r>
               <w:rPr>
                 <w:color w:val="000000"/>
-                <w:highlight w:val="yellow"/>
               </w:rPr>
-              <w:t>###</w:t>
-            </w:r>
-          </w:p>
-        </w:tc>
-      </w:tr>
-      <w:tr>
-        <w:trPr>
-          <w:jc w:val="center"/>
-        </w:trPr>
-        <w:tc>
-          <w:tcPr>
-            <w:tcW w:w="1165" w:type="dxa"/>
-          </w:tcPr>
-          <w:p>
-            <w:pPr>
-              <w:rPr>
-                <w:color w:val="000000"/>
-                <w:highlight w:val="yellow"/>
-              </w:rPr>
-            </w:pPr>
-            <w:r>
-              <w:rPr>
-                <w:color w:val="000000"/>
-                <w:highlight w:val="yellow"/>
-              </w:rPr>
-              <w:t>###</w:t>
-            </w:r>
-          </w:p>
-        </w:tc>
-        <w:tc>
-          <w:tcPr>
-            <w:tcW w:w="8977" w:type="dxa"/>
-          </w:tcPr>
-          <w:p>
-            <w:pPr>
-              <w:rPr>
-                <w:color w:val="000000"/>
-                <w:highlight w:val="yellow"/>
-              </w:rPr>
-            </w:pPr>
-            <w:r>
-              <w:rPr>
-                <w:color w:val="000000"/>
-                <w:highlight w:val="yellow"/>
-              </w:rPr>
-              <w:t>###</w:t>
-            </w:r>
-          </w:p>
-        </w:tc>
-      </w:tr>
-      <w:tr>
-        <w:trPr>
-          <w:jc w:val="center"/>
-        </w:trPr>
-        <w:tc>
-          <w:tcPr>
-            <w:tcW w:w="1165" w:type="dxa"/>
-          </w:tcPr>
-          <w:p>
-            <w:pPr>
-              <w:rPr>
-                <w:color w:val="000000"/>
-                <w:highlight w:val="yellow"/>
-              </w:rPr>
-            </w:pPr>
-            <w:r>
-              <w:rPr>
-                <w:color w:val="000000"/>
-                <w:highlight w:val="yellow"/>
-              </w:rPr>
-              <w:t>###</w:t>
-            </w:r>
-          </w:p>
-        </w:tc>
-        <w:tc>
-          <w:tcPr>
-            <w:tcW w:w="8977" w:type="dxa"/>
-          </w:tcPr>
-          <w:p>
-            <w:pPr>
-              <w:rPr>
-                <w:color w:val="000000"/>
-                <w:highlight w:val="yellow"/>
-              </w:rPr>
-            </w:pPr>
-            <w:r>
-              <w:rPr>
-                <w:color w:val="000000"/>
-                <w:highlight w:val="yellow"/>
-              </w:rPr>
-              <w:t>###</w:t>
-            </w:r>
-          </w:p>
-        </w:tc>
-      </w:tr>
-      <w:tr>
-        <w:trPr>
-          <w:jc w:val="center"/>
-        </w:trPr>
-        <w:tc>
-          <w:tcPr>
-            <w:tcW w:w="1165" w:type="dxa"/>
-          </w:tcPr>
-          <w:p>
-            <w:pPr>
-              <w:rPr>
-                <w:color w:val="000000"/>
-                <w:highlight w:val="yellow"/>
-              </w:rPr>
-            </w:pPr>
-            <w:r>
-              <w:rPr>
-                <w:color w:val="000000"/>
-                <w:highlight w:val="yellow"/>
-              </w:rPr>
-              <w:t>###</w:t>
-            </w:r>
-          </w:p>
-        </w:tc>
-        <w:tc>
-          <w:tcPr>
-            <w:tcW w:w="8977" w:type="dxa"/>
-          </w:tcPr>
-          <w:p>
-            <w:pPr>
-              <w:rPr>
-                <w:color w:val="000000"/>
-                <w:highlight w:val="yellow"/>
-              </w:rPr>
-            </w:pPr>
-            <w:r>
-              <w:rPr>
-                <w:color w:val="000000"/>
-                <w:highlight w:val="yellow"/>
-              </w:rPr>
-              <w:t>###</w:t>
-            </w:r>
-          </w:p>
-        </w:tc>
-      </w:tr>
-      <w:tr>
-        <w:trPr>
-          <w:jc w:val="center"/>
-        </w:trPr>
-        <w:tc>
-          <w:tcPr>
-            <w:tcW w:w="1165" w:type="dxa"/>
-          </w:tcPr>
-          <w:p>
-            <w:pPr>
-              <w:rPr>
-                <w:color w:val="000000"/>
-                <w:highlight w:val="yellow"/>
-              </w:rPr>
-            </w:pPr>
-            <w:r>
-              <w:rPr>
-                <w:color w:val="000000"/>
-                <w:highlight w:val="yellow"/>
-              </w:rPr>
-              <w:t>###</w:t>
-            </w:r>
-          </w:p>
-        </w:tc>
-        <w:tc>
-          <w:tcPr>
-            <w:tcW w:w="8977" w:type="dxa"/>
-          </w:tcPr>
-          <w:p>
-            <w:pPr>
-              <w:rPr>
-                <w:color w:val="000000"/>
-                <w:highlight w:val="yellow"/>
-              </w:rPr>
-            </w:pPr>
-            <w:r>
-              <w:rPr>
-                <w:color w:val="000000"/>
-                <w:highlight w:val="yellow"/>
-              </w:rPr>
-              <w:t>###</w:t>
-            </w:r>
-          </w:p>
-        </w:tc>
-      </w:tr>
-      <w:tr>
-        <w:trPr>
-          <w:jc w:val="center"/>
-        </w:trPr>
-        <w:tc>
-          <w:tcPr>
-            <w:tcW w:w="1165" w:type="dxa"/>
-          </w:tcPr>
-          <w:p>
-            <w:pPr>
-              <w:rPr>
-                <w:color w:val="000000"/>
-                <w:highlight w:val="yellow"/>
-              </w:rPr>
-            </w:pPr>
-            <w:r>
-              <w:rPr>
-                <w:color w:val="000000"/>
-                <w:highlight w:val="yellow"/>
-              </w:rPr>
-              <w:t>###</w:t>
-            </w:r>
-          </w:p>
-        </w:tc>
-        <w:tc>
-          <w:tcPr>
-            <w:tcW w:w="8977" w:type="dxa"/>
-          </w:tcPr>
-          <w:p>
-            <w:pPr>
-              <w:rPr>
-                <w:color w:val="000000"/>
-                <w:highlight w:val="yellow"/>
-              </w:rPr>
-            </w:pPr>
-            <w:r>
-              <w:rPr>
-                <w:color w:val="000000"/>
-                <w:highlight w:val="yellow"/>
-              </w:rPr>
-              <w:t>###</w:t>
-            </w:r>
-          </w:p>
-        </w:tc>
-      </w:tr>
-      <w:tr>
-        <w:trPr>
-          <w:jc w:val="center"/>
-        </w:trPr>
-        <w:tc>
-          <w:tcPr>
-            <w:tcW w:w="1165" w:type="dxa"/>
-          </w:tcPr>
-          <w:p>
-            <w:pPr>
-              <w:rPr>
-                <w:color w:val="000000"/>
-                <w:highlight w:val="yellow"/>
-              </w:rPr>
-            </w:pPr>
-            <w:r>
-              <w:rPr>
-                <w:color w:val="000000"/>
-                <w:highlight w:val="yellow"/>
-              </w:rPr>
-              <w:t>###</w:t>
-            </w:r>
-          </w:p>
-        </w:tc>
-        <w:tc>
-          <w:tcPr>
-            <w:tcW w:w="8977" w:type="dxa"/>
-          </w:tcPr>
-          <w:p>
-            <w:pPr>
-              <w:rPr>
-                <w:color w:val="000000"/>
-                <w:highlight w:val="yellow"/>
-              </w:rPr>
-            </w:pPr>
-            <w:r>
-              <w:rPr>
-                <w:color w:val="000000"/>
-                <w:highlight w:val="yellow"/>
-              </w:rPr>
-              <w:t>###</w:t>
-            </w:r>
-          </w:p>
-        </w:tc>
-      </w:tr>
-      <w:tr>
-        <w:trPr>
-          <w:jc w:val="center"/>
-        </w:trPr>
-        <w:tc>
-          <w:tcPr>
-            <w:tcW w:w="1165" w:type="dxa"/>
-          </w:tcPr>
-          <w:p>
-            <w:pPr>
-              <w:rPr>
-                <w:color w:val="000000"/>
-                <w:highlight w:val="yellow"/>
-              </w:rPr>
-            </w:pPr>
-            <w:r>
-              <w:rPr>
-                <w:color w:val="000000"/>
-                <w:highlight w:val="yellow"/>
-              </w:rPr>
-              <w:t>###</w:t>
-            </w:r>
-          </w:p>
-        </w:tc>
-        <w:tc>
-          <w:tcPr>
-            <w:tcW w:w="8977" w:type="dxa"/>
-          </w:tcPr>
-          <w:p>
-            <w:pPr>
-              <w:rPr>
-                <w:color w:val="000000"/>
-                <w:highlight w:val="yellow"/>
-              </w:rPr>
-            </w:pPr>
-            <w:r>
-              <w:rPr>
-                <w:color w:val="000000"/>
-                <w:highlight w:val="yellow"/>
-              </w:rPr>
-              <w:t>###</w:t>
-            </w:r>
-          </w:p>
-        </w:tc>
-      </w:tr>
-      <w:tr>
-        <w:trPr>
-          <w:jc w:val="center"/>
-        </w:trPr>
-        <w:tc>
-          <w:tcPr>
-            <w:tcW w:w="1165" w:type="dxa"/>
-          </w:tcPr>
-          <w:p>
-            <w:pPr>
-              <w:rPr>
-                <w:color w:val="000000"/>
-                <w:highlight w:val="yellow"/>
-              </w:rPr>
-            </w:pPr>
-            <w:r>
-              <w:rPr>
-                <w:color w:val="000000"/>
-                <w:highlight w:val="yellow"/>
-              </w:rPr>
-              <w:t>###</w:t>
-            </w:r>
-          </w:p>
-        </w:tc>
-        <w:tc>
-          <w:tcPr>
-            <w:tcW w:w="8977" w:type="dxa"/>
-          </w:tcPr>
-          <w:p>
-            <w:pPr>
-              <w:rPr>
-                <w:color w:val="000000"/>
-                <w:highlight w:val="yellow"/>
-              </w:rPr>
-            </w:pPr>
-            <w:r>
-              <w:rPr>
-                <w:color w:val="000000"/>
-                <w:highlight w:val="yellow"/>
-              </w:rPr>
-              <w:t>###</w:t>
-            </w:r>
-          </w:p>
-        </w:tc>
-      </w:tr>
-      <w:tr>
-        <w:trPr>
-          <w:jc w:val="center"/>
-        </w:trPr>
-        <w:tc>
-          <w:tcPr>
-            <w:tcW w:w="1165" w:type="dxa"/>
-          </w:tcPr>
-          <w:p>
-            <w:pPr>
-              <w:rPr>
-                <w:color w:val="000000"/>
-                <w:highlight w:val="yellow"/>
-              </w:rPr>
-            </w:pPr>
-            <w:r>
-              <w:rPr>
-                <w:color w:val="000000"/>
-                <w:highlight w:val="yellow"/>
-              </w:rPr>
-              <w:t>###</w:t>
-            </w:r>
-          </w:p>
-        </w:tc>
-        <w:tc>
-          <w:tcPr>
-            <w:tcW w:w="8977" w:type="dxa"/>
-          </w:tcPr>
-          <w:p>
-            <w:pPr>
-              <w:rPr>
-                <w:color w:val="000000"/>
-                <w:highlight w:val="yellow"/>
-              </w:rPr>
-            </w:pPr>
-            <w:r>
-              <w:rPr>
-                <w:color w:val="000000"/>
-                <w:highlight w:val="yellow"/>
-              </w:rPr>
-              <w:t>###</w:t>
-            </w:r>
-          </w:p>
-        </w:tc>
-      </w:tr>
-      <w:tr>
-        <w:trPr>
-          <w:jc w:val="center"/>
-        </w:trPr>
-        <w:tc>
-          <w:tcPr>
-            <w:tcW w:w="1165" w:type="dxa"/>
-          </w:tcPr>
-          <w:p>
-            <w:pPr>
-              <w:rPr>
-                <w:color w:val="000000"/>
-                <w:highlight w:val="yellow"/>
-              </w:rPr>
-            </w:pPr>
-            <w:r>
-              <w:rPr>
-                <w:color w:val="000000"/>
-                <w:highlight w:val="yellow"/>
-              </w:rPr>
-              <w:t>###</w:t>
-            </w:r>
-          </w:p>
-        </w:tc>
-        <w:tc>
-          <w:tcPr>
-            <w:tcW w:w="8977" w:type="dxa"/>
-          </w:tcPr>
-          <w:p>
-            <w:pPr>
-              <w:rPr>
-                <w:color w:val="000000"/>
-                <w:highlight w:val="yellow"/>
-              </w:rPr>
-            </w:pPr>
-            <w:r>
-              <w:rPr>
-                <w:color w:val="000000"/>
-                <w:highlight w:val="yellow"/>
-              </w:rPr>
-              <w:t>This is a table with hidden borders; insert new rows below for more acronyms</w:t>
+              <w:t>minimum detectable effect</w:t>
             </w:r>
           </w:p>
         </w:tc>
@@ -975,11 +524,7 @@
           <w:cols w:space="720"/>
         </w:sectPr>
       </w:pPr>
-      <w:r>
-        <w:br w:type="page"/>
-      </w:r>
     </w:p>
-    <w:p/>
     <w:bookmarkStart w:id="5" w:name="executive-summary"/>
     <w:p>
       <w:pPr>
@@ -1275,6 +820,7 @@
     <w:p>
       <w:pPr>
         <w:pStyle w:val="BodyText"/>
+        <w:keepNext/>
       </w:pPr>
       <w:r>
         <w:rPr>
@@ -1297,7 +843,9 @@
         <w:gridCol w:w="2640"/>
       </w:tblGrid>
       <w:tr>
-        <w:trPr/>
+        <w:trPr>
+          <w:cantSplit/>
+        </w:trPr>
         <w:tc>
           <w:tcPr>
             <w:shd w:val="clear" w:color="auto" w:fill="008CCC"/>
@@ -1305,6 +853,7 @@
           <w:p>
             <w:pPr>
               <w:pStyle w:val="Compact"/>
+              <w:keepNext/>
             </w:pPr>
             <w:r>
               <w:rPr>
@@ -1326,6 +875,7 @@
           <w:p>
             <w:pPr>
               <w:pStyle w:val="Compact"/>
+              <w:keepNext/>
             </w:pPr>
             <w:r>
               <w:rPr>
@@ -1347,6 +897,7 @@
           <w:p>
             <w:pPr>
               <w:pStyle w:val="Compact"/>
+              <w:keepNext/>
             </w:pPr>
             <w:r>
               <w:rPr>
@@ -1363,6 +914,9 @@
         </w:tc>
       </w:tr>
       <w:tr>
+        <w:trPr>
+          <w:cantSplit/>
+        </w:trPr>
         <w:tc>
           <w:tcPr>
             <w:shd w:val="clear" w:color="auto" w:fill="FFFFFF"/>
@@ -1422,6 +976,9 @@
         </w:tc>
       </w:tr>
       <w:tr>
+        <w:trPr>
+          <w:cantSplit/>
+        </w:trPr>
         <w:tc>
           <w:tcPr>
             <w:shd w:val="clear" w:color="auto" w:fill="D4E2E9"/>
@@ -1481,6 +1038,9 @@
         </w:tc>
       </w:tr>
       <w:tr>
+        <w:trPr>
+          <w:cantSplit/>
+        </w:trPr>
         <w:tc>
           <w:tcPr>
             <w:shd w:val="clear" w:color="auto" w:fill="FFFFFF"/>
@@ -1540,6 +1100,9 @@
         </w:tc>
       </w:tr>
       <w:tr>
+        <w:trPr>
+          <w:cantSplit/>
+        </w:trPr>
         <w:tc>
           <w:tcPr>
             <w:shd w:val="clear" w:color="auto" w:fill="D4E2E9"/>
@@ -1599,6 +1162,9 @@
         </w:tc>
       </w:tr>
       <w:tr>
+        <w:trPr>
+          <w:cantSplit/>
+        </w:trPr>
         <w:tc>
           <w:tcPr>
             <w:shd w:val="clear" w:color="auto" w:fill="FFFFFF"/>
@@ -1658,6 +1224,9 @@
         </w:tc>
       </w:tr>
       <w:tr>
+        <w:trPr>
+          <w:cantSplit/>
+        </w:trPr>
         <w:tc>
           <w:tcPr>
             <w:shd w:val="clear" w:color="auto" w:fill="D4E2E9"/>
@@ -1782,6 +1351,7 @@
     <w:p>
       <w:pPr>
         <w:pStyle w:val="FirstParagraph"/>
+        <w:keepNext/>
       </w:pPr>
       <w:r>
         <w:rPr>
@@ -1806,7 +1376,9 @@
         <w:gridCol w:w="1320"/>
       </w:tblGrid>
       <w:tr>
-        <w:trPr/>
+        <w:trPr>
+          <w:cantSplit/>
+        </w:trPr>
         <w:tc>
           <w:tcPr>
             <w:shd w:val="clear" w:color="auto" w:fill="008CCC"/>
@@ -1814,6 +1386,7 @@
           <w:p>
             <w:pPr>
               <w:pStyle w:val="Compact"/>
+              <w:keepNext/>
             </w:pPr>
             <w:r>
               <w:rPr>
@@ -1835,6 +1408,7 @@
           <w:p>
             <w:pPr>
               <w:pStyle w:val="Compact"/>
+              <w:keepNext/>
             </w:pPr>
             <w:r>
               <w:rPr>
@@ -1856,6 +1430,7 @@
           <w:p>
             <w:pPr>
               <w:pStyle w:val="Compact"/>
+              <w:keepNext/>
             </w:pPr>
             <w:r>
               <w:rPr>
@@ -1877,6 +1452,7 @@
           <w:p>
             <w:pPr>
               <w:pStyle w:val="Compact"/>
+              <w:keepNext/>
             </w:pPr>
             <w:r>
               <w:rPr>
@@ -1898,6 +1474,7 @@
           <w:p>
             <w:pPr>
               <w:pStyle w:val="Compact"/>
+              <w:keepNext/>
             </w:pPr>
             <w:r>
               <w:rPr>
@@ -1919,6 +1496,7 @@
           <w:p>
             <w:pPr>
               <w:pStyle w:val="Compact"/>
+              <w:keepNext/>
             </w:pPr>
             <w:r>
               <w:rPr>
@@ -1935,6 +1513,9 @@
         </w:tc>
       </w:tr>
       <w:tr>
+        <w:trPr>
+          <w:cantSplit/>
+        </w:trPr>
         <w:tc>
           <w:tcPr>
             <w:shd w:val="clear" w:color="auto" w:fill="FFFFFF"/>
@@ -2051,6 +1632,9 @@
         </w:tc>
       </w:tr>
       <w:tr>
+        <w:trPr>
+          <w:cantSplit/>
+        </w:trPr>
         <w:tc>
           <w:tcPr>
             <w:shd w:val="clear" w:color="auto" w:fill="D4E2E9"/>
@@ -2167,6 +1751,9 @@
         </w:tc>
       </w:tr>
       <w:tr>
+        <w:trPr>
+          <w:cantSplit/>
+        </w:trPr>
         <w:tc>
           <w:tcPr>
             <w:shd w:val="clear" w:color="auto" w:fill="FFFFFF"/>
@@ -5390,7 +4977,7 @@
     </w:lvl>
   </w:abstractNum>
   <w:abstractNum w:abstractNumId="17">
-    <w:nsid w:val="0468858A"/>
+    <w:nsid w:val="0091854C"/>
     <w:multiLevelType w:val="multilevel"/>
     <w:lvl w:ilvl="0">
       <w:numFmt w:val="bullet"/>
@@ -5493,7 +5080,7 @@
     </w:lvl>
   </w:abstractNum>
   <w:abstractNum w:abstractNumId="18">
-    <w:nsid w:val="03D9A57C"/>
+    <w:nsid w:val="02711AB1"/>
     <w:multiLevelType w:val="multilevel"/>
     <w:lvl w:ilvl="0">
       <w:start w:val="1"/>
@@ -6115,8 +5702,7 @@
     <w:pPr>
       <w:keepNext/>
       <w:keepLines/>
-      <w:pageBreakBefore/>
-      <w:spacing w:after="180"/>
+      <w:spacing w:before="480" w:after="180"/>
       <w:ind w:left="0"/>
       <w:jc w:val="left"/>
       <w:outlineLvl w:val="0"/>

</xml_diff>